<commit_message>
Engraved further + all edits from errata v1 and v2 made
</commit_message>
<xml_diff>
--- a/Proof Reading and Review/LARA Bonecas Russas - Errata_v2 (108-128, 137-144).docx
+++ b/Proof Reading and Review/LARA Bonecas Russas - Errata_v2 (108-128, 137-144).docx
@@ -129,53 +129,471 @@
           <w:ilvl w:val="0"/>
           <w:numId w:val="2"/>
         </w:numPr>
+      </w:pPr>
+      <w:r>
+        <w:t>M109, voice</w:t>
+      </w:r>
+      <w:r>
+        <w:t xml:space="preserve"> - </w:t>
+      </w:r>
+      <w:r>
+        <w:t xml:space="preserve">“de” should be its own word, not hyphenated; </w:t>
+      </w:r>
+      <w:proofErr w:type="gramStart"/>
+      <w:r>
+        <w:t>Also</w:t>
+      </w:r>
+      <w:proofErr w:type="gramEnd"/>
+      <w:r>
+        <w:t xml:space="preserve"> please add natural on D on beat 4</w:t>
+      </w:r>
+    </w:p>
+    <w:p>
+      <w:pPr>
+        <w:rPr>
+          <w:b/>
+          <w:bCs/>
+        </w:rPr>
+      </w:pPr>
+    </w:p>
+    <w:p>
+      <w:pPr>
+        <w:pStyle w:val="ListParagraph"/>
+        <w:numPr>
+          <w:ilvl w:val="0"/>
+          <w:numId w:val="2"/>
+        </w:numPr>
+      </w:pPr>
+      <w:r>
+        <w:t>M111, voice – slur should start on the downbeat of beat 1, not on last note of previous measure</w:t>
+      </w:r>
+      <w:r>
+        <w:t xml:space="preserve">, also beat 2 missing natural </w:t>
+      </w:r>
+      <w:proofErr w:type="gramStart"/>
+      <w:r>
+        <w:t>sign</w:t>
+      </w:r>
+      <w:proofErr w:type="gramEnd"/>
+    </w:p>
+    <w:p>
+      <w:pPr>
+        <w:pStyle w:val="ListParagraph"/>
+        <w:rPr>
+          <w:b/>
+          <w:bCs/>
+        </w:rPr>
+      </w:pPr>
+    </w:p>
+    <w:p>
+      <w:pPr>
+        <w:pStyle w:val="ListParagraph"/>
+        <w:numPr>
+          <w:ilvl w:val="0"/>
+          <w:numId w:val="2"/>
+        </w:numPr>
+      </w:pPr>
+      <w:r>
+        <w:t xml:space="preserve">M112, </w:t>
+      </w:r>
+      <w:proofErr w:type="spellStart"/>
+      <w:r>
+        <w:t>bcl</w:t>
+      </w:r>
+      <w:proofErr w:type="spellEnd"/>
+      <w:r>
+        <w:t xml:space="preserve"> – add natural on low C</w:t>
+      </w:r>
+    </w:p>
+    <w:p>
+      <w:pPr>
+        <w:pStyle w:val="ListParagraph"/>
         <w:rPr>
           <w:b/>
           <w:bCs/>
           <w:color w:val="FF0000"/>
         </w:rPr>
       </w:pPr>
-      <w:r>
+    </w:p>
+    <w:p>
+      <w:pPr>
+        <w:pStyle w:val="ListParagraph"/>
+        <w:numPr>
+          <w:ilvl w:val="0"/>
+          <w:numId w:val="2"/>
+        </w:numPr>
+      </w:pPr>
+      <w:r>
+        <w:t xml:space="preserve">M112, </w:t>
+      </w:r>
+      <w:proofErr w:type="spellStart"/>
+      <w:r>
+        <w:t>tbn</w:t>
+      </w:r>
+      <w:proofErr w:type="spellEnd"/>
+      <w:r>
+        <w:t xml:space="preserve"> – add natural to C in parenthesis</w:t>
+      </w:r>
+    </w:p>
+    <w:p>
+      <w:pPr>
+        <w:pStyle w:val="ListParagraph"/>
         <w:rPr>
           <w:b/>
           <w:bCs/>
           <w:color w:val="FF0000"/>
         </w:rPr>
-        <w:t>M109, voice</w:t>
-      </w:r>
-      <w:r>
+      </w:pPr>
+    </w:p>
+    <w:p>
+      <w:pPr>
+        <w:pStyle w:val="ListParagraph"/>
+        <w:numPr>
+          <w:ilvl w:val="0"/>
+          <w:numId w:val="2"/>
+        </w:numPr>
+      </w:pPr>
+      <w:r>
+        <w:t>M113, voice – first note, add natural</w:t>
+      </w:r>
+    </w:p>
+    <w:p>
+      <w:pPr>
+        <w:pStyle w:val="ListParagraph"/>
+        <w:rPr>
+          <w:b/>
+          <w:bCs/>
+        </w:rPr>
+      </w:pPr>
+    </w:p>
+    <w:p>
+      <w:pPr>
+        <w:pStyle w:val="ListParagraph"/>
+        <w:numPr>
+          <w:ilvl w:val="0"/>
+          <w:numId w:val="2"/>
+        </w:numPr>
+      </w:pPr>
+      <w:r>
+        <w:t xml:space="preserve">M113, </w:t>
+      </w:r>
+      <w:proofErr w:type="spellStart"/>
+      <w:r>
+        <w:t>tpt</w:t>
+      </w:r>
+      <w:proofErr w:type="spellEnd"/>
+      <w:r>
+        <w:t xml:space="preserve"> </w:t>
+      </w:r>
+      <w:r>
+        <w:t>–</w:t>
+      </w:r>
+      <w:r>
+        <w:t xml:space="preserve"> </w:t>
+      </w:r>
+      <w:r>
+        <w:t>last two notes have not been transposed, spell them as C ¼ flat and Eb</w:t>
+      </w:r>
+    </w:p>
+    <w:p>
+      <w:pPr>
+        <w:pStyle w:val="ListParagraph"/>
+        <w:rPr>
+          <w:b/>
+          <w:bCs/>
+        </w:rPr>
+      </w:pPr>
+    </w:p>
+    <w:p>
+      <w:pPr>
+        <w:pStyle w:val="ListParagraph"/>
+        <w:numPr>
+          <w:ilvl w:val="0"/>
+          <w:numId w:val="2"/>
+        </w:numPr>
+      </w:pPr>
+      <w:r>
+        <w:t xml:space="preserve">M114, </w:t>
+      </w:r>
+      <w:proofErr w:type="spellStart"/>
+      <w:r>
+        <w:t>tpt</w:t>
+      </w:r>
+      <w:proofErr w:type="spellEnd"/>
+      <w:r>
+        <w:t xml:space="preserve"> – beat 4, wrong note, please spell it as C ¼ flat</w:t>
+      </w:r>
+    </w:p>
+    <w:p>
+      <w:pPr>
+        <w:pStyle w:val="ListParagraph"/>
+        <w:rPr>
+          <w:b/>
+          <w:bCs/>
+        </w:rPr>
+      </w:pPr>
+    </w:p>
+    <w:p>
+      <w:pPr>
+        <w:pStyle w:val="ListParagraph"/>
+        <w:numPr>
+          <w:ilvl w:val="0"/>
+          <w:numId w:val="2"/>
+        </w:numPr>
+      </w:pPr>
+      <w:r>
+        <w:t>M115, voice – add sharps in both G and F on beat 3</w:t>
+      </w:r>
+    </w:p>
+    <w:p>
+      <w:pPr>
+        <w:pStyle w:val="ListParagraph"/>
+        <w:rPr>
+          <w:b/>
+          <w:bCs/>
+        </w:rPr>
+      </w:pPr>
+    </w:p>
+    <w:p>
+      <w:pPr>
+        <w:pStyle w:val="ListParagraph"/>
+        <w:numPr>
+          <w:ilvl w:val="0"/>
+          <w:numId w:val="2"/>
+        </w:numPr>
+      </w:pPr>
+      <w:r>
+        <w:t xml:space="preserve"> </w:t>
+      </w:r>
+      <w:r>
+        <w:t xml:space="preserve">M115, </w:t>
+      </w:r>
+      <w:proofErr w:type="spellStart"/>
+      <w:r>
+        <w:t>tpt</w:t>
+      </w:r>
+      <w:proofErr w:type="spellEnd"/>
+      <w:r>
+        <w:t xml:space="preserve"> – re-spell both E# as F naturals</w:t>
+      </w:r>
+    </w:p>
+    <w:p>
+      <w:pPr>
+        <w:pStyle w:val="ListParagraph"/>
         <w:rPr>
           <w:b/>
           <w:bCs/>
           <w:color w:val="FF0000"/>
         </w:rPr>
-        <w:t xml:space="preserve"> - </w:t>
-      </w:r>
-      <w:r>
+      </w:pPr>
+    </w:p>
+    <w:p>
+      <w:pPr>
+        <w:pStyle w:val="ListParagraph"/>
+        <w:numPr>
+          <w:ilvl w:val="0"/>
+          <w:numId w:val="2"/>
+        </w:numPr>
+      </w:pPr>
+      <w:r>
+        <w:t>M117, tutti – missing fermata between M117 and 118</w:t>
+      </w:r>
+    </w:p>
+    <w:p>
+      <w:pPr>
+        <w:pStyle w:val="ListParagraph"/>
         <w:rPr>
           <w:b/>
           <w:bCs/>
           <w:color w:val="FF0000"/>
         </w:rPr>
-        <w:t xml:space="preserve">“de” should be its own word, not hyphenated; </w:t>
-      </w:r>
-      <w:proofErr w:type="gramStart"/>
-      <w:r>
+      </w:pPr>
+    </w:p>
+    <w:p>
+      <w:pPr>
+        <w:pStyle w:val="ListParagraph"/>
+        <w:numPr>
+          <w:ilvl w:val="0"/>
+          <w:numId w:val="2"/>
+        </w:numPr>
+      </w:pPr>
+      <w:r>
+        <w:t>M120, voice, add text “-</w:t>
+      </w:r>
+      <w:proofErr w:type="spellStart"/>
+      <w:r>
+        <w:t>ção</w:t>
+      </w:r>
+      <w:proofErr w:type="spellEnd"/>
+      <w:r>
+        <w:t>” …I forgot in manuscript</w:t>
+      </w:r>
+    </w:p>
+    <w:p>
+      <w:pPr>
+        <w:pStyle w:val="ListParagraph"/>
+        <w:rPr>
+          <w:b/>
+          <w:bCs/>
+        </w:rPr>
+      </w:pPr>
+    </w:p>
+    <w:p>
+      <w:pPr>
+        <w:pStyle w:val="ListParagraph"/>
+        <w:numPr>
+          <w:ilvl w:val="0"/>
+          <w:numId w:val="2"/>
+        </w:numPr>
+      </w:pPr>
+      <w:r>
+        <w:t>M120-121, tutti – all voices missing crescendo to ff in the end of 121</w:t>
+      </w:r>
+    </w:p>
+    <w:p>
+      <w:pPr>
+        <w:pStyle w:val="ListParagraph"/>
         <w:rPr>
           <w:b/>
           <w:bCs/>
           <w:color w:val="FF0000"/>
         </w:rPr>
-        <w:t>Also</w:t>
-      </w:r>
-      <w:proofErr w:type="gramEnd"/>
-      <w:r>
+      </w:pPr>
+    </w:p>
+    <w:p>
+      <w:pPr>
+        <w:pStyle w:val="ListParagraph"/>
+        <w:numPr>
+          <w:ilvl w:val="0"/>
+          <w:numId w:val="2"/>
+        </w:numPr>
+      </w:pPr>
+      <w:r>
+        <w:t>M121, tutti – add “(fermata after last repeat only)</w:t>
+      </w:r>
+    </w:p>
+    <w:p>
+      <w:pPr>
+        <w:pStyle w:val="ListParagraph"/>
         <w:rPr>
           <w:b/>
           <w:bCs/>
           <w:color w:val="FF0000"/>
         </w:rPr>
-        <w:t xml:space="preserve"> please add natural on D on beat 4</w:t>
+      </w:pPr>
+    </w:p>
+    <w:p>
+      <w:pPr>
+        <w:pStyle w:val="ListParagraph"/>
+        <w:numPr>
+          <w:ilvl w:val="0"/>
+          <w:numId w:val="2"/>
+        </w:numPr>
+      </w:pPr>
+      <w:r>
+        <w:t>M</w:t>
+      </w:r>
+      <w:r>
+        <w:t xml:space="preserve">123, </w:t>
+      </w:r>
+      <w:proofErr w:type="spellStart"/>
+      <w:r>
+        <w:t>bcl</w:t>
+      </w:r>
+      <w:proofErr w:type="spellEnd"/>
+      <w:r>
+        <w:t xml:space="preserve"> – make last note into C ¼ flat</w:t>
+      </w:r>
+    </w:p>
+    <w:p>
+      <w:pPr>
+        <w:pStyle w:val="ListParagraph"/>
+        <w:rPr>
+          <w:b/>
+          <w:bCs/>
+        </w:rPr>
+      </w:pPr>
+    </w:p>
+    <w:p>
+      <w:pPr>
+        <w:pStyle w:val="ListParagraph"/>
+        <w:numPr>
+          <w:ilvl w:val="0"/>
+          <w:numId w:val="2"/>
+        </w:numPr>
+      </w:pPr>
+      <w:r>
+        <w:t>M124, voice – add # on G# beat 3</w:t>
+      </w:r>
+    </w:p>
+    <w:p>
+      <w:pPr>
+        <w:pStyle w:val="ListParagraph"/>
+        <w:rPr>
+          <w:b/>
+          <w:bCs/>
+        </w:rPr>
+      </w:pPr>
+    </w:p>
+    <w:p>
+      <w:pPr>
+        <w:pStyle w:val="ListParagraph"/>
+        <w:numPr>
+          <w:ilvl w:val="0"/>
+          <w:numId w:val="2"/>
+        </w:numPr>
+      </w:pPr>
+      <w:r>
+        <w:t xml:space="preserve">M125, </w:t>
+      </w:r>
+      <w:proofErr w:type="spellStart"/>
+      <w:r>
+        <w:t>bcl</w:t>
+      </w:r>
+      <w:proofErr w:type="spellEnd"/>
+      <w:r>
+        <w:t xml:space="preserve"> – beat 3 add natural to A</w:t>
+      </w:r>
+    </w:p>
+    <w:p>
+      <w:pPr>
+        <w:pStyle w:val="ListParagraph"/>
+        <w:rPr>
+          <w:b/>
+          <w:bCs/>
+        </w:rPr>
+      </w:pPr>
+    </w:p>
+    <w:p>
+      <w:pPr>
+        <w:pStyle w:val="ListParagraph"/>
+        <w:numPr>
+          <w:ilvl w:val="0"/>
+          <w:numId w:val="2"/>
+        </w:numPr>
+      </w:pPr>
+      <w:r>
+        <w:t xml:space="preserve">M126, </w:t>
+      </w:r>
+      <w:proofErr w:type="spellStart"/>
+      <w:r>
+        <w:t>tpt</w:t>
+      </w:r>
+      <w:proofErr w:type="spellEnd"/>
+      <w:r>
+        <w:t xml:space="preserve"> </w:t>
+      </w:r>
+      <w:r>
+        <w:t>–</w:t>
+      </w:r>
+      <w:r>
+        <w:t xml:space="preserve"> </w:t>
+      </w:r>
+      <w:r>
+        <w:t>first note should be C (hasn’t been transposed)</w:t>
+      </w:r>
+      <w:r>
+        <w:t>, also beat 3 add natural</w:t>
       </w:r>
     </w:p>
     <w:p>
@@ -194,892 +612,66 @@
           <w:ilvl w:val="0"/>
           <w:numId w:val="2"/>
         </w:numPr>
+      </w:pPr>
+      <w:r>
+        <w:t>M127, voice – add natural to F</w:t>
+      </w:r>
+    </w:p>
+    <w:p>
+      <w:pPr>
+        <w:rPr>
+          <w:b/>
+          <w:bCs/>
+        </w:rPr>
+      </w:pPr>
+    </w:p>
+    <w:p>
+      <w:pPr>
+        <w:pStyle w:val="ListParagraph"/>
+        <w:numPr>
+          <w:ilvl w:val="0"/>
+          <w:numId w:val="2"/>
+        </w:numPr>
+      </w:pPr>
+      <w:r>
+        <w:t xml:space="preserve">M127, </w:t>
+      </w:r>
+      <w:proofErr w:type="spellStart"/>
+      <w:r>
+        <w:t>tpt</w:t>
+      </w:r>
+      <w:proofErr w:type="spellEnd"/>
+      <w:r>
+        <w:t xml:space="preserve"> – beat 4, wrong note, should be F 1/6 flat </w:t>
+      </w:r>
+    </w:p>
+    <w:p>
+      <w:pPr>
+        <w:pStyle w:val="ListParagraph"/>
         <w:rPr>
           <w:b/>
           <w:bCs/>
           <w:color w:val="FF0000"/>
         </w:rPr>
       </w:pPr>
-      <w:r>
-        <w:rPr>
-          <w:b/>
-          <w:bCs/>
-          <w:color w:val="FF0000"/>
-        </w:rPr>
-        <w:t>M111, voice – slur should start on the downbeat of beat 1, not on last note of previous measure</w:t>
-      </w:r>
-      <w:r>
-        <w:rPr>
-          <w:b/>
-          <w:bCs/>
-          <w:color w:val="FF0000"/>
-        </w:rPr>
-        <w:t xml:space="preserve">, also beat 2 missing natural </w:t>
-      </w:r>
-      <w:proofErr w:type="gramStart"/>
-      <w:r>
-        <w:rPr>
-          <w:b/>
-          <w:bCs/>
-          <w:color w:val="FF0000"/>
-        </w:rPr>
-        <w:t>sign</w:t>
-      </w:r>
-      <w:proofErr w:type="gramEnd"/>
-    </w:p>
-    <w:p>
-      <w:pPr>
-        <w:pStyle w:val="ListParagraph"/>
-        <w:rPr>
-          <w:b/>
-          <w:bCs/>
-          <w:color w:val="FF0000"/>
-        </w:rPr>
-      </w:pPr>
-    </w:p>
-    <w:p>
-      <w:pPr>
-        <w:pStyle w:val="ListParagraph"/>
-        <w:numPr>
-          <w:ilvl w:val="0"/>
-          <w:numId w:val="2"/>
-        </w:numPr>
-        <w:rPr>
-          <w:b/>
-          <w:bCs/>
-          <w:color w:val="FF0000"/>
-        </w:rPr>
-      </w:pPr>
-      <w:r>
-        <w:rPr>
-          <w:b/>
-          <w:bCs/>
-          <w:color w:val="FF0000"/>
-        </w:rPr>
-        <w:t xml:space="preserve">M112, </w:t>
+    </w:p>
+    <w:p>
+      <w:pPr>
+        <w:pStyle w:val="ListParagraph"/>
+        <w:numPr>
+          <w:ilvl w:val="0"/>
+          <w:numId w:val="2"/>
+        </w:numPr>
+      </w:pPr>
+      <w:r>
+        <w:t xml:space="preserve">M128, </w:t>
       </w:r>
       <w:proofErr w:type="spellStart"/>
       <w:r>
-        <w:rPr>
-          <w:b/>
-          <w:bCs/>
-          <w:color w:val="FF0000"/>
-        </w:rPr>
         <w:t>bcl</w:t>
       </w:r>
       <w:proofErr w:type="spellEnd"/>
       <w:r>
-        <w:rPr>
-          <w:b/>
-          <w:bCs/>
-          <w:color w:val="FF0000"/>
-        </w:rPr>
-        <w:t xml:space="preserve"> – add natural on low C</w:t>
-      </w:r>
-    </w:p>
-    <w:p>
-      <w:pPr>
-        <w:pStyle w:val="ListParagraph"/>
-        <w:rPr>
-          <w:b/>
-          <w:bCs/>
-          <w:color w:val="FF0000"/>
-        </w:rPr>
-      </w:pPr>
-    </w:p>
-    <w:p>
-      <w:pPr>
-        <w:pStyle w:val="ListParagraph"/>
-        <w:numPr>
-          <w:ilvl w:val="0"/>
-          <w:numId w:val="2"/>
-        </w:numPr>
-        <w:rPr>
-          <w:b/>
-          <w:bCs/>
-          <w:color w:val="FF0000"/>
-        </w:rPr>
-      </w:pPr>
-      <w:r>
-        <w:rPr>
-          <w:b/>
-          <w:bCs/>
-          <w:color w:val="FF0000"/>
-        </w:rPr>
-        <w:t xml:space="preserve">M112, </w:t>
-      </w:r>
-      <w:proofErr w:type="spellStart"/>
-      <w:r>
-        <w:rPr>
-          <w:b/>
-          <w:bCs/>
-          <w:color w:val="FF0000"/>
-        </w:rPr>
-        <w:t>tbn</w:t>
-      </w:r>
-      <w:proofErr w:type="spellEnd"/>
-      <w:r>
-        <w:rPr>
-          <w:b/>
-          <w:bCs/>
-          <w:color w:val="FF0000"/>
-        </w:rPr>
-        <w:t xml:space="preserve"> – add natural to C in parenthesis</w:t>
-      </w:r>
-    </w:p>
-    <w:p>
-      <w:pPr>
-        <w:pStyle w:val="ListParagraph"/>
-        <w:rPr>
-          <w:b/>
-          <w:bCs/>
-          <w:color w:val="FF0000"/>
-        </w:rPr>
-      </w:pPr>
-    </w:p>
-    <w:p>
-      <w:pPr>
-        <w:pStyle w:val="ListParagraph"/>
-        <w:numPr>
-          <w:ilvl w:val="0"/>
-          <w:numId w:val="2"/>
-        </w:numPr>
-        <w:rPr>
-          <w:b/>
-          <w:bCs/>
-          <w:color w:val="FF0000"/>
-        </w:rPr>
-      </w:pPr>
-      <w:r>
-        <w:rPr>
-          <w:b/>
-          <w:bCs/>
-          <w:color w:val="FF0000"/>
-        </w:rPr>
-        <w:t>M113, voice – first note, add natural</w:t>
-      </w:r>
-    </w:p>
-    <w:p>
-      <w:pPr>
-        <w:pStyle w:val="ListParagraph"/>
-        <w:rPr>
-          <w:b/>
-          <w:bCs/>
-          <w:color w:val="FF0000"/>
-        </w:rPr>
-      </w:pPr>
-    </w:p>
-    <w:p>
-      <w:pPr>
-        <w:pStyle w:val="ListParagraph"/>
-        <w:numPr>
-          <w:ilvl w:val="0"/>
-          <w:numId w:val="2"/>
-        </w:numPr>
-        <w:rPr>
-          <w:b/>
-          <w:bCs/>
-          <w:color w:val="FF0000"/>
-        </w:rPr>
-      </w:pPr>
-      <w:r>
-        <w:rPr>
-          <w:b/>
-          <w:bCs/>
-          <w:color w:val="FF0000"/>
-        </w:rPr>
-        <w:t xml:space="preserve">M113, </w:t>
-      </w:r>
-      <w:proofErr w:type="spellStart"/>
-      <w:r>
-        <w:rPr>
-          <w:b/>
-          <w:bCs/>
-          <w:color w:val="FF0000"/>
-        </w:rPr>
-        <w:t>tpt</w:t>
-      </w:r>
-      <w:proofErr w:type="spellEnd"/>
-      <w:r>
-        <w:rPr>
-          <w:b/>
-          <w:bCs/>
-          <w:color w:val="FF0000"/>
-        </w:rPr>
-        <w:t xml:space="preserve"> </w:t>
-      </w:r>
-      <w:r>
-        <w:rPr>
-          <w:b/>
-          <w:bCs/>
-          <w:color w:val="FF0000"/>
-        </w:rPr>
-        <w:t>–</w:t>
-      </w:r>
-      <w:r>
-        <w:rPr>
-          <w:b/>
-          <w:bCs/>
-          <w:color w:val="FF0000"/>
-        </w:rPr>
-        <w:t xml:space="preserve"> </w:t>
-      </w:r>
-      <w:r>
-        <w:rPr>
-          <w:b/>
-          <w:bCs/>
-          <w:color w:val="FF0000"/>
-        </w:rPr>
-        <w:t>last two notes have not been transposed, spell them as C ¼ flat and Eb</w:t>
-      </w:r>
-    </w:p>
-    <w:p>
-      <w:pPr>
-        <w:pStyle w:val="ListParagraph"/>
-        <w:rPr>
-          <w:b/>
-          <w:bCs/>
-          <w:color w:val="FF0000"/>
-        </w:rPr>
-      </w:pPr>
-    </w:p>
-    <w:p>
-      <w:pPr>
-        <w:pStyle w:val="ListParagraph"/>
-        <w:numPr>
-          <w:ilvl w:val="0"/>
-          <w:numId w:val="2"/>
-        </w:numPr>
-        <w:rPr>
-          <w:b/>
-          <w:bCs/>
-          <w:color w:val="FF0000"/>
-        </w:rPr>
-      </w:pPr>
-      <w:r>
-        <w:rPr>
-          <w:b/>
-          <w:bCs/>
-          <w:color w:val="FF0000"/>
-        </w:rPr>
-        <w:t xml:space="preserve">M114, </w:t>
-      </w:r>
-      <w:proofErr w:type="spellStart"/>
-      <w:r>
-        <w:rPr>
-          <w:b/>
-          <w:bCs/>
-          <w:color w:val="FF0000"/>
-        </w:rPr>
-        <w:t>tpt</w:t>
-      </w:r>
-      <w:proofErr w:type="spellEnd"/>
-      <w:r>
-        <w:rPr>
-          <w:b/>
-          <w:bCs/>
-          <w:color w:val="FF0000"/>
-        </w:rPr>
-        <w:t xml:space="preserve"> – beat 4, wrong note, please spell it as C ¼ flat</w:t>
-      </w:r>
-    </w:p>
-    <w:p>
-      <w:pPr>
-        <w:pStyle w:val="ListParagraph"/>
-        <w:rPr>
-          <w:b/>
-          <w:bCs/>
-          <w:color w:val="FF0000"/>
-        </w:rPr>
-      </w:pPr>
-    </w:p>
-    <w:p>
-      <w:pPr>
-        <w:pStyle w:val="ListParagraph"/>
-        <w:numPr>
-          <w:ilvl w:val="0"/>
-          <w:numId w:val="2"/>
-        </w:numPr>
-        <w:rPr>
-          <w:b/>
-          <w:bCs/>
-          <w:color w:val="FF0000"/>
-        </w:rPr>
-      </w:pPr>
-      <w:r>
-        <w:rPr>
-          <w:b/>
-          <w:bCs/>
-          <w:color w:val="FF0000"/>
-        </w:rPr>
-        <w:t>M115, voice – add sharps in both G and F on beat 3</w:t>
-      </w:r>
-    </w:p>
-    <w:p>
-      <w:pPr>
-        <w:pStyle w:val="ListParagraph"/>
-        <w:rPr>
-          <w:b/>
-          <w:bCs/>
-          <w:color w:val="FF0000"/>
-        </w:rPr>
-      </w:pPr>
-    </w:p>
-    <w:p>
-      <w:pPr>
-        <w:pStyle w:val="ListParagraph"/>
-        <w:numPr>
-          <w:ilvl w:val="0"/>
-          <w:numId w:val="2"/>
-        </w:numPr>
-        <w:rPr>
-          <w:b/>
-          <w:bCs/>
-          <w:color w:val="FF0000"/>
-        </w:rPr>
-      </w:pPr>
-      <w:r>
-        <w:rPr>
-          <w:b/>
-          <w:bCs/>
-          <w:color w:val="FF0000"/>
-        </w:rPr>
-        <w:t xml:space="preserve"> </w:t>
-      </w:r>
-      <w:r>
-        <w:rPr>
-          <w:b/>
-          <w:bCs/>
-          <w:color w:val="FF0000"/>
-        </w:rPr>
-        <w:t xml:space="preserve">M115, </w:t>
-      </w:r>
-      <w:proofErr w:type="spellStart"/>
-      <w:r>
-        <w:rPr>
-          <w:b/>
-          <w:bCs/>
-          <w:color w:val="FF0000"/>
-        </w:rPr>
-        <w:t>tpt</w:t>
-      </w:r>
-      <w:proofErr w:type="spellEnd"/>
-      <w:r>
-        <w:rPr>
-          <w:b/>
-          <w:bCs/>
-          <w:color w:val="FF0000"/>
-        </w:rPr>
-        <w:t xml:space="preserve"> – re-spell both E# as F naturals</w:t>
-      </w:r>
-    </w:p>
-    <w:p>
-      <w:pPr>
-        <w:pStyle w:val="ListParagraph"/>
-        <w:rPr>
-          <w:b/>
-          <w:bCs/>
-          <w:color w:val="FF0000"/>
-        </w:rPr>
-      </w:pPr>
-    </w:p>
-    <w:p>
-      <w:pPr>
-        <w:pStyle w:val="ListParagraph"/>
-        <w:numPr>
-          <w:ilvl w:val="0"/>
-          <w:numId w:val="2"/>
-        </w:numPr>
-        <w:rPr>
-          <w:b/>
-          <w:bCs/>
-          <w:color w:val="FF0000"/>
-        </w:rPr>
-      </w:pPr>
-      <w:r>
-        <w:rPr>
-          <w:b/>
-          <w:bCs/>
-          <w:color w:val="FF0000"/>
-        </w:rPr>
-        <w:t>M117, tutti – missing fermata between M117 and 118</w:t>
-      </w:r>
-    </w:p>
-    <w:p>
-      <w:pPr>
-        <w:pStyle w:val="ListParagraph"/>
-        <w:rPr>
-          <w:b/>
-          <w:bCs/>
-          <w:color w:val="FF0000"/>
-        </w:rPr>
-      </w:pPr>
-    </w:p>
-    <w:p>
-      <w:pPr>
-        <w:pStyle w:val="ListParagraph"/>
-        <w:numPr>
-          <w:ilvl w:val="0"/>
-          <w:numId w:val="2"/>
-        </w:numPr>
-        <w:rPr>
-          <w:b/>
-          <w:bCs/>
-          <w:color w:val="FF0000"/>
-        </w:rPr>
-      </w:pPr>
-      <w:r>
-        <w:rPr>
-          <w:b/>
-          <w:bCs/>
-          <w:color w:val="FF0000"/>
-        </w:rPr>
-        <w:t>M120, voice, add text “-</w:t>
-      </w:r>
-      <w:proofErr w:type="spellStart"/>
-      <w:r>
-        <w:rPr>
-          <w:b/>
-          <w:bCs/>
-          <w:color w:val="FF0000"/>
-        </w:rPr>
-        <w:t>ção</w:t>
-      </w:r>
-      <w:proofErr w:type="spellEnd"/>
-      <w:r>
-        <w:rPr>
-          <w:b/>
-          <w:bCs/>
-          <w:color w:val="FF0000"/>
-        </w:rPr>
-        <w:t>” …I forgot in manuscript</w:t>
-      </w:r>
-    </w:p>
-    <w:p>
-      <w:pPr>
-        <w:pStyle w:val="ListParagraph"/>
-        <w:rPr>
-          <w:b/>
-          <w:bCs/>
-          <w:color w:val="FF0000"/>
-        </w:rPr>
-      </w:pPr>
-    </w:p>
-    <w:p>
-      <w:pPr>
-        <w:pStyle w:val="ListParagraph"/>
-        <w:numPr>
-          <w:ilvl w:val="0"/>
-          <w:numId w:val="2"/>
-        </w:numPr>
-        <w:rPr>
-          <w:b/>
-          <w:bCs/>
-          <w:color w:val="FF0000"/>
-        </w:rPr>
-      </w:pPr>
-      <w:r>
-        <w:rPr>
-          <w:b/>
-          <w:bCs/>
-          <w:color w:val="FF0000"/>
-        </w:rPr>
-        <w:t>M120-121, tutti – all voices missing crescendo to ff in the end of 121</w:t>
-      </w:r>
-    </w:p>
-    <w:p>
-      <w:pPr>
-        <w:pStyle w:val="ListParagraph"/>
-        <w:rPr>
-          <w:b/>
-          <w:bCs/>
-          <w:color w:val="FF0000"/>
-        </w:rPr>
-      </w:pPr>
-    </w:p>
-    <w:p>
-      <w:pPr>
-        <w:pStyle w:val="ListParagraph"/>
-        <w:numPr>
-          <w:ilvl w:val="0"/>
-          <w:numId w:val="2"/>
-        </w:numPr>
-        <w:rPr>
-          <w:b/>
-          <w:bCs/>
-          <w:color w:val="FF0000"/>
-        </w:rPr>
-      </w:pPr>
-      <w:r>
-        <w:rPr>
-          <w:b/>
-          <w:bCs/>
-          <w:color w:val="FF0000"/>
-        </w:rPr>
-        <w:t>M121, tutti – add “(fermata after last repeat only)</w:t>
-      </w:r>
-    </w:p>
-    <w:p>
-      <w:pPr>
-        <w:pStyle w:val="ListParagraph"/>
-        <w:rPr>
-          <w:b/>
-          <w:bCs/>
-          <w:color w:val="FF0000"/>
-        </w:rPr>
-      </w:pPr>
-    </w:p>
-    <w:p>
-      <w:pPr>
-        <w:pStyle w:val="ListParagraph"/>
-        <w:numPr>
-          <w:ilvl w:val="0"/>
-          <w:numId w:val="2"/>
-        </w:numPr>
-        <w:rPr>
-          <w:b/>
-          <w:bCs/>
-          <w:color w:val="FF0000"/>
-        </w:rPr>
-      </w:pPr>
-      <w:r>
-        <w:rPr>
-          <w:b/>
-          <w:bCs/>
-          <w:color w:val="FF0000"/>
-        </w:rPr>
-        <w:t>M</w:t>
-      </w:r>
-      <w:r>
-        <w:rPr>
-          <w:b/>
-          <w:bCs/>
-          <w:color w:val="FF0000"/>
-        </w:rPr>
-        <w:t xml:space="preserve">123, </w:t>
-      </w:r>
-      <w:proofErr w:type="spellStart"/>
-      <w:r>
-        <w:rPr>
-          <w:b/>
-          <w:bCs/>
-          <w:color w:val="FF0000"/>
-        </w:rPr>
-        <w:t>bcl</w:t>
-      </w:r>
-      <w:proofErr w:type="spellEnd"/>
-      <w:r>
-        <w:rPr>
-          <w:b/>
-          <w:bCs/>
-          <w:color w:val="FF0000"/>
-        </w:rPr>
-        <w:t xml:space="preserve"> – make last note into C ¼ flat</w:t>
-      </w:r>
-    </w:p>
-    <w:p>
-      <w:pPr>
-        <w:pStyle w:val="ListParagraph"/>
-        <w:rPr>
-          <w:b/>
-          <w:bCs/>
-          <w:color w:val="FF0000"/>
-        </w:rPr>
-      </w:pPr>
-    </w:p>
-    <w:p>
-      <w:pPr>
-        <w:pStyle w:val="ListParagraph"/>
-        <w:numPr>
-          <w:ilvl w:val="0"/>
-          <w:numId w:val="2"/>
-        </w:numPr>
-        <w:rPr>
-          <w:b/>
-          <w:bCs/>
-          <w:color w:val="FF0000"/>
-        </w:rPr>
-      </w:pPr>
-      <w:r>
-        <w:rPr>
-          <w:b/>
-          <w:bCs/>
-          <w:color w:val="FF0000"/>
-        </w:rPr>
-        <w:t>M124, voice – add # on G# beat 3</w:t>
-      </w:r>
-    </w:p>
-    <w:p>
-      <w:pPr>
-        <w:pStyle w:val="ListParagraph"/>
-        <w:rPr>
-          <w:b/>
-          <w:bCs/>
-          <w:color w:val="FF0000"/>
-        </w:rPr>
-      </w:pPr>
-    </w:p>
-    <w:p>
-      <w:pPr>
-        <w:pStyle w:val="ListParagraph"/>
-        <w:numPr>
-          <w:ilvl w:val="0"/>
-          <w:numId w:val="2"/>
-        </w:numPr>
-        <w:rPr>
-          <w:b/>
-          <w:bCs/>
-          <w:color w:val="FF0000"/>
-        </w:rPr>
-      </w:pPr>
-      <w:r>
-        <w:rPr>
-          <w:b/>
-          <w:bCs/>
-          <w:color w:val="FF0000"/>
-        </w:rPr>
-        <w:t xml:space="preserve">M125, </w:t>
-      </w:r>
-      <w:proofErr w:type="spellStart"/>
-      <w:r>
-        <w:rPr>
-          <w:b/>
-          <w:bCs/>
-          <w:color w:val="FF0000"/>
-        </w:rPr>
-        <w:t>bcl</w:t>
-      </w:r>
-      <w:proofErr w:type="spellEnd"/>
-      <w:r>
-        <w:rPr>
-          <w:b/>
-          <w:bCs/>
-          <w:color w:val="FF0000"/>
-        </w:rPr>
-        <w:t xml:space="preserve"> – beat 3 add natural to A</w:t>
-      </w:r>
-    </w:p>
-    <w:p>
-      <w:pPr>
-        <w:pStyle w:val="ListParagraph"/>
-        <w:rPr>
-          <w:b/>
-          <w:bCs/>
-          <w:color w:val="FF0000"/>
-        </w:rPr>
-      </w:pPr>
-    </w:p>
-    <w:p>
-      <w:pPr>
-        <w:pStyle w:val="ListParagraph"/>
-        <w:numPr>
-          <w:ilvl w:val="0"/>
-          <w:numId w:val="2"/>
-        </w:numPr>
-        <w:rPr>
-          <w:b/>
-          <w:bCs/>
-          <w:color w:val="FF0000"/>
-        </w:rPr>
-      </w:pPr>
-      <w:r>
-        <w:rPr>
-          <w:b/>
-          <w:bCs/>
-          <w:color w:val="FF0000"/>
-        </w:rPr>
-        <w:t xml:space="preserve">M126, </w:t>
-      </w:r>
-      <w:proofErr w:type="spellStart"/>
-      <w:r>
-        <w:rPr>
-          <w:b/>
-          <w:bCs/>
-          <w:color w:val="FF0000"/>
-        </w:rPr>
-        <w:t>tpt</w:t>
-      </w:r>
-      <w:proofErr w:type="spellEnd"/>
-      <w:r>
-        <w:rPr>
-          <w:b/>
-          <w:bCs/>
-          <w:color w:val="FF0000"/>
-        </w:rPr>
-        <w:t xml:space="preserve"> </w:t>
-      </w:r>
-      <w:r>
-        <w:rPr>
-          <w:b/>
-          <w:bCs/>
-          <w:color w:val="FF0000"/>
-        </w:rPr>
-        <w:t>–</w:t>
-      </w:r>
-      <w:r>
-        <w:rPr>
-          <w:b/>
-          <w:bCs/>
-          <w:color w:val="FF0000"/>
-        </w:rPr>
-        <w:t xml:space="preserve"> </w:t>
-      </w:r>
-      <w:r>
-        <w:rPr>
-          <w:b/>
-          <w:bCs/>
-          <w:color w:val="FF0000"/>
-        </w:rPr>
-        <w:t>first note should be C (hasn’t been transposed)</w:t>
-      </w:r>
-      <w:r>
-        <w:rPr>
-          <w:b/>
-          <w:bCs/>
-          <w:color w:val="FF0000"/>
-        </w:rPr>
-        <w:t>, also beat 3 add natural</w:t>
-      </w:r>
-    </w:p>
-    <w:p>
-      <w:pPr>
-        <w:pStyle w:val="ListParagraph"/>
-        <w:rPr>
-          <w:b/>
-          <w:bCs/>
-          <w:color w:val="FF0000"/>
-        </w:rPr>
-      </w:pPr>
-    </w:p>
-    <w:p>
-      <w:pPr>
-        <w:pStyle w:val="ListParagraph"/>
-        <w:rPr>
-          <w:b/>
-          <w:bCs/>
-          <w:color w:val="FF0000"/>
-        </w:rPr>
-      </w:pPr>
-    </w:p>
-    <w:p>
-      <w:pPr>
-        <w:pStyle w:val="ListParagraph"/>
-        <w:numPr>
-          <w:ilvl w:val="0"/>
-          <w:numId w:val="2"/>
-        </w:numPr>
-        <w:rPr>
-          <w:b/>
-          <w:bCs/>
-          <w:color w:val="FF0000"/>
-        </w:rPr>
-      </w:pPr>
-      <w:r>
-        <w:rPr>
-          <w:b/>
-          <w:bCs/>
-          <w:color w:val="FF0000"/>
-        </w:rPr>
-        <w:lastRenderedPageBreak/>
-        <w:t>M127, voice – add natural to F</w:t>
-      </w:r>
-    </w:p>
-    <w:p>
-      <w:pPr>
-        <w:rPr>
-          <w:b/>
-          <w:bCs/>
-          <w:color w:val="FF0000"/>
-        </w:rPr>
-      </w:pPr>
-    </w:p>
-    <w:p>
-      <w:pPr>
-        <w:pStyle w:val="ListParagraph"/>
-        <w:numPr>
-          <w:ilvl w:val="0"/>
-          <w:numId w:val="2"/>
-        </w:numPr>
-        <w:rPr>
-          <w:b/>
-          <w:bCs/>
-          <w:color w:val="FF0000"/>
-        </w:rPr>
-      </w:pPr>
-      <w:r>
-        <w:rPr>
-          <w:b/>
-          <w:bCs/>
-          <w:color w:val="FF0000"/>
-        </w:rPr>
-        <w:t xml:space="preserve">M127, </w:t>
-      </w:r>
-      <w:proofErr w:type="spellStart"/>
-      <w:r>
-        <w:rPr>
-          <w:b/>
-          <w:bCs/>
-          <w:color w:val="FF0000"/>
-        </w:rPr>
-        <w:t>tpt</w:t>
-      </w:r>
-      <w:proofErr w:type="spellEnd"/>
-      <w:r>
-        <w:rPr>
-          <w:b/>
-          <w:bCs/>
-          <w:color w:val="FF0000"/>
-        </w:rPr>
-        <w:t xml:space="preserve"> – beat 4, wrong note, should be F 1/6 flat </w:t>
-      </w:r>
-    </w:p>
-    <w:p>
-      <w:pPr>
-        <w:pStyle w:val="ListParagraph"/>
-        <w:rPr>
-          <w:b/>
-          <w:bCs/>
-          <w:color w:val="FF0000"/>
-        </w:rPr>
-      </w:pPr>
-    </w:p>
-    <w:p>
-      <w:pPr>
-        <w:pStyle w:val="ListParagraph"/>
-        <w:numPr>
-          <w:ilvl w:val="0"/>
-          <w:numId w:val="2"/>
-        </w:numPr>
-        <w:rPr>
-          <w:b/>
-          <w:bCs/>
-          <w:color w:val="FF0000"/>
-        </w:rPr>
-      </w:pPr>
-      <w:r>
-        <w:rPr>
-          <w:b/>
-          <w:bCs/>
-          <w:color w:val="FF0000"/>
-        </w:rPr>
-        <w:t xml:space="preserve">M128, </w:t>
-      </w:r>
-      <w:proofErr w:type="spellStart"/>
-      <w:r>
-        <w:rPr>
-          <w:b/>
-          <w:bCs/>
-          <w:color w:val="FF0000"/>
-        </w:rPr>
-        <w:t>bcl</w:t>
-      </w:r>
-      <w:proofErr w:type="spellEnd"/>
-      <w:r>
-        <w:rPr>
-          <w:b/>
-          <w:bCs/>
-          <w:color w:val="FF0000"/>
-        </w:rPr>
         <w:t xml:space="preserve"> – beat 2 missing natural</w:t>
       </w:r>
     </w:p>

</xml_diff>